<commit_message>
Remove trailing line breaks
</commit_message>
<xml_diff>
--- a/arches_her/docx/No Need to Consult letter.docx
+++ b/arches_her/docx/No Need to Consult letter.docx
@@ -1226,20 +1226,6 @@
         </w:rPr>
         <w:t>Only consult us on householder applications if they are in a tier 1 APA or involve substantial demolition or alteration of historic buildings.</w:t>
       </w:r>
-    </w:p>
-    <w:p>
-      <w:pPr>
-        <w:rPr>
-          <w:rFonts w:cstheme="minorHAnsi"/>
-        </w:rPr>
-      </w:pPr>
-    </w:p>
-    <w:p>
-      <w:pPr>
-        <w:rPr>
-          <w:rFonts w:cstheme="minorHAnsi"/>
-        </w:rPr>
-      </w:pPr>
     </w:p>
     <w:p>
       <w:pPr>
@@ -1489,29 +1475,7 @@
         <w:sz w:val="16"/>
         <w:szCs w:val="16"/>
       </w:rPr>
-      <w:t xml:space="preserve">Historic England, 4th Floor, Cannon Bridge House, 25 </w:t>
-    </w:r>
-    <w:proofErr w:type="spellStart"/>
-    <w:r>
-      <w:rPr>
-        <w:rFonts w:ascii="Arial" w:hAnsi="Arial"/>
-        <w:b/>
-        <w:bCs/>
-        <w:sz w:val="16"/>
-        <w:szCs w:val="16"/>
-      </w:rPr>
-      <w:t>Dowgate</w:t>
-    </w:r>
-    <w:proofErr w:type="spellEnd"/>
-    <w:r>
-      <w:rPr>
-        <w:rFonts w:ascii="Arial" w:hAnsi="Arial"/>
-        <w:b/>
-        <w:bCs/>
-        <w:sz w:val="16"/>
-        <w:szCs w:val="16"/>
-      </w:rPr>
-      <w:t xml:space="preserve"> Hill, London EC4R 2YA</w:t>
+      <w:t>Historic England, 4th Floor, Cannon Bridge House, 25 Dowgate Hill, London EC4R 2YA</w:t>
     </w:r>
     <w:r>
       <w:rPr>
@@ -3415,6 +3379,15 @@
 </file>
 
 <file path=customXml/item1.xml><?xml version="1.0" encoding="utf-8"?>
+<?mso-contentType ?>
+<FormTemplates xmlns="http://schemas.microsoft.com/sharepoint/v3/contenttype/forms">
+  <Display>DocumentLibraryForm</Display>
+  <Edit>DocumentLibraryForm</Edit>
+  <New>DocumentLibraryForm</New>
+</FormTemplates>
+</file>
+
+<file path=customXml/item2.xml><?xml version="1.0" encoding="utf-8"?>
 <p:properties xmlns:p="http://schemas.microsoft.com/office/2006/metadata/properties" xmlns:xsi="http://www.w3.org/2001/XMLSchema-instance" xmlns:pc="http://schemas.microsoft.com/office/infopath/2007/PartnerControls">
   <documentManagement>
     <lcf76f155ced4ddcb4097134ff3c332f xmlns="e789b7fa-a83c-4c6b-9e01-87c723f67228">
@@ -3425,16 +3398,11 @@
 </p:properties>
 </file>
 
-<file path=customXml/item2.xml><?xml version="1.0" encoding="utf-8"?>
-<?mso-contentType ?>
-<FormTemplates xmlns="http://schemas.microsoft.com/sharepoint/v3/contenttype/forms">
-  <Display>DocumentLibraryForm</Display>
-  <Edit>DocumentLibraryForm</Edit>
-  <New>DocumentLibraryForm</New>
-</FormTemplates>
+<file path=customXml/item3.xml><?xml version="1.0" encoding="utf-8"?>
+<b:Sources xmlns:b="http://schemas.openxmlformats.org/officeDocument/2006/bibliography" xmlns="http://schemas.openxmlformats.org/officeDocument/2006/bibliography" SelectedStyle="/APASixthEditionOfficeOnline.xsl" StyleName="APA" Version="6"/>
 </file>
 
-<file path=customXml/item3.xml><?xml version="1.0" encoding="utf-8"?>
+<file path=customXml/item4.xml><?xml version="1.0" encoding="utf-8"?>
 <ct:contentTypeSchema xmlns:ct="http://schemas.microsoft.com/office/2006/metadata/contentType" xmlns:ma="http://schemas.microsoft.com/office/2006/metadata/properties/metaAttributes" ct:_="" ma:_="" ma:contentTypeName="Document" ma:contentTypeID="0x010100B89331DE8EA64F4FBEA00113BF0E4514" ma:contentTypeVersion="11" ma:contentTypeDescription="Create a new document." ma:contentTypeScope="" ma:versionID="0b60b04e60edb8b2e7e2fe1cc7d413e0">
   <xsd:schema xmlns:xsd="http://www.w3.org/2001/XMLSchema" xmlns:xs="http://www.w3.org/2001/XMLSchema" xmlns:p="http://schemas.microsoft.com/office/2006/metadata/properties" xmlns:ns2="e789b7fa-a83c-4c6b-9e01-87c723f67228" xmlns:ns3="bb952b06-3268-4e55-b0fe-9eb49669fc08" targetNamespace="http://schemas.microsoft.com/office/2006/metadata/properties" ma:root="true" ma:fieldsID="52467e30880403e5f73a15b97b0992c8" ns2:_="" ns3:_="">
     <xsd:import namespace="e789b7fa-a83c-4c6b-9e01-87c723f67228"/>
@@ -3629,11 +3597,15 @@
 </ct:contentTypeSchema>
 </file>
 
-<file path=customXml/item4.xml><?xml version="1.0" encoding="utf-8"?>
-<b:Sources xmlns:b="http://schemas.openxmlformats.org/officeDocument/2006/bibliography" xmlns="http://schemas.openxmlformats.org/officeDocument/2006/bibliography" SelectedStyle="/APASixthEditionOfficeOnline.xsl" StyleName="APA" Version="6"/>
+<file path=customXml/itemProps1.xml><?xml version="1.0" encoding="utf-8"?>
+<ds:datastoreItem xmlns:ds="http://schemas.openxmlformats.org/officeDocument/2006/customXml" ds:itemID="{45FB1F57-968F-4A6E-AEE9-65961EB5FADD}">
+  <ds:schemaRefs>
+    <ds:schemaRef ds:uri="http://schemas.microsoft.com/sharepoint/v3/contenttype/forms"/>
+  </ds:schemaRefs>
+</ds:datastoreItem>
 </file>
 
-<file path=customXml/itemProps1.xml><?xml version="1.0" encoding="utf-8"?>
+<file path=customXml/itemProps2.xml><?xml version="1.0" encoding="utf-8"?>
 <ds:datastoreItem xmlns:ds="http://schemas.openxmlformats.org/officeDocument/2006/customXml" ds:itemID="{EF43FDED-CD1D-4301-B761-71C1DCC851CC}">
   <ds:schemaRefs>
     <ds:schemaRef ds:uri="http://schemas.microsoft.com/office/2006/metadata/properties"/>
@@ -3644,15 +3616,15 @@
 </ds:datastoreItem>
 </file>
 
-<file path=customXml/itemProps2.xml><?xml version="1.0" encoding="utf-8"?>
-<ds:datastoreItem xmlns:ds="http://schemas.openxmlformats.org/officeDocument/2006/customXml" ds:itemID="{45FB1F57-968F-4A6E-AEE9-65961EB5FADD}">
+<file path=customXml/itemProps3.xml><?xml version="1.0" encoding="utf-8"?>
+<ds:datastoreItem xmlns:ds="http://schemas.openxmlformats.org/officeDocument/2006/customXml" ds:itemID="{3B4892E8-18D6-D444-BA6E-299F0B60384F}">
   <ds:schemaRefs>
-    <ds:schemaRef ds:uri="http://schemas.microsoft.com/sharepoint/v3/contenttype/forms"/>
+    <ds:schemaRef ds:uri="http://schemas.openxmlformats.org/officeDocument/2006/bibliography"/>
   </ds:schemaRefs>
 </ds:datastoreItem>
 </file>
 
-<file path=customXml/itemProps3.xml><?xml version="1.0" encoding="utf-8"?>
+<file path=customXml/itemProps4.xml><?xml version="1.0" encoding="utf-8"?>
 <ds:datastoreItem xmlns:ds="http://schemas.openxmlformats.org/officeDocument/2006/customXml" ds:itemID="{93F00A47-6514-4C46-91C6-8D2331E8318E}">
   <ds:schemaRefs>
     <ds:schemaRef ds:uri="http://schemas.microsoft.com/office/2006/metadata/contentType"/>
@@ -3669,12 +3641,4 @@
     <ds:schemaRef ds:uri="http://schemas.microsoft.com/internal/obd"/>
   </ds:schemaRefs>
 </ds:datastoreItem>
-</file>
-
-<file path=customXml/itemProps4.xml><?xml version="1.0" encoding="utf-8"?>
-<ds:datastoreItem xmlns:ds="http://schemas.openxmlformats.org/officeDocument/2006/customXml" ds:itemID="{3B4892E8-18D6-D444-BA6E-299F0B60384F}">
-  <ds:schemaRefs>
-    <ds:schemaRef ds:uri="http://schemas.openxmlformats.org/officeDocument/2006/bibliography"/>
-  </ds:schemaRefs>
-</ds:datastoreItem>
 </file>
</xml_diff>